<commit_message>
Replace Lab 1 log captures with live console evidence and add final PDF
</commit_message>
<xml_diff>
--- a/Lab1/submission/JustinLee_S8115784_Lab1_Report.docx
+++ b/Lab1/submission/JustinLee_S8115784_Lab1_Report.docx
@@ -505,7 +505,7 @@
         </w:trPr>
         <w:tc>
           <w:tcPr>
-            <w:tcW w:type="dxa" w:w="3278"/>
+            <w:tcW w:type="dxa" w:w="864"/>
             <w:shd w:fill="E4EDF4"/>
             <w:tcBorders>
               <w:top w:val="single" w:sz="4" w:color="D9D9D9"/>
@@ -529,7 +529,7 @@
         </w:tc>
         <w:tc>
           <w:tcPr>
-            <w:tcW w:type="dxa" w:w="3278"/>
+            <w:tcW w:type="dxa" w:w="3888"/>
             <w:shd w:fill="E4EDF4"/>
             <w:tcBorders>
               <w:top w:val="single" w:sz="4" w:color="D9D9D9"/>
@@ -553,7 +553,7 @@
         </w:tc>
         <w:tc>
           <w:tcPr>
-            <w:tcW w:type="dxa" w:w="3278"/>
+            <w:tcW w:type="dxa" w:w="4968"/>
             <w:shd w:fill="E4EDF4"/>
             <w:tcBorders>
               <w:top w:val="single" w:sz="4" w:color="D9D9D9"/>
@@ -638,12 +638,8 @@
             </w:tcBorders>
           </w:tcPr>
           <w:p>
-            <w:pPr>
-              <w:spacing w:after="100" w:before="100"/>
-            </w:pPr>
             <w:r>
               <w:rPr>
-                <w:b w:val="0"/>
                 <w:sz w:val="18"/>
               </w:rPr>
               <w:t>$10.00</w:t>
@@ -713,12 +709,8 @@
             </w:tcBorders>
           </w:tcPr>
           <w:p>
-            <w:pPr>
-              <w:spacing w:after="100" w:before="100"/>
-            </w:pPr>
             <w:r>
               <w:rPr>
-                <w:b w:val="0"/>
                 <w:sz w:val="18"/>
               </w:rPr>
               <w:t>$20.00</w:t>
@@ -788,12 +780,8 @@
             </w:tcBorders>
           </w:tcPr>
           <w:p>
-            <w:pPr>
-              <w:spacing w:after="100" w:before="100"/>
-            </w:pPr>
             <w:r>
               <w:rPr>
-                <w:b w:val="0"/>
                 <w:sz w:val="18"/>
               </w:rPr>
               <w:t>$30.00</w:t>
@@ -863,12 +851,8 @@
             </w:tcBorders>
           </w:tcPr>
           <w:p>
-            <w:pPr>
-              <w:spacing w:after="100" w:before="100"/>
-            </w:pPr>
             <w:r>
               <w:rPr>
-                <w:b w:val="0"/>
                 <w:sz w:val="18"/>
               </w:rPr>
               <w:t>$40.00</w:t>
@@ -1992,19 +1976,19 @@
     </w:p>
     <w:p>
       <w:r>
-        <w:t>The following screenshots show a local execution log viewer displaying unchanged stdout from the test runner. They are captures of recorded console output, rather than native Terminal windows. The five subscription captures and the summary originate from one program process. Full inputs and outputs are included in tests/results.json.</w:t>
+        <w:t>These screenshots were captured while operating the running .NET console application through an xterm browser terminal connected to a local pseudo-terminal (PTY). Keyboard input is forwarded to the process and output is displayed live. The images show entered values and console responses; they are not replayed test logs.</w:t>
       </w:r>
     </w:p>
     <w:p>
       <w:r>
-        <w:t>Start the program and choose A. Confirm the identity banner and the four plan IDs and prices before creating a subscription.</w:t>
+        <w:t>Start the console application and enter A. The live screen shows Justin Lee as Administrator and all four plan IDs and monthly prices.</w:t>
       </w:r>
     </w:p>
     <w:p>
       <w:r>
         <w:drawing>
           <wp:inline xmlns:a="http://schemas.openxmlformats.org/drawingml/2006/main" xmlns:pic="http://schemas.openxmlformats.org/drawingml/2006/picture">
-            <wp:extent cx="6172200" cy="3754755"/>
+            <wp:extent cx="6172200" cy="4812224"/>
             <wp:docPr id="1" name="Picture 1"/>
             <wp:cNvGraphicFramePr>
               <a:graphicFrameLocks noChangeAspect="1"/>
@@ -2013,11 +1997,11 @@
               <a:graphicData uri="http://schemas.openxmlformats.org/drawingml/2006/picture">
                 <pic:pic>
                   <pic:nvPicPr>
-                    <pic:cNvPr id="0" name="capture-1.png"/>
+                    <pic:cNvPr id="0" name="01-plans.jpg"/>
                     <pic:cNvPicPr/>
                   </pic:nvPicPr>
                   <pic:blipFill>
-                    <a:blip r:embed="rId30"/>
+                    <a:blip r:embed="rId37"/>
                     <a:stretch>
                       <a:fillRect/>
                     </a:stretch>
@@ -2025,7 +2009,7 @@
                   <pic:spPr>
                     <a:xfrm>
                       <a:off x="0" y="0"/>
-                      <a:ext cx="6172200" cy="3754755"/>
+                      <a:ext cx="6172200" cy="4812224"/>
                     </a:xfrm>
                     <a:prstGeom prst="rect"/>
                   </pic:spPr>
@@ -2041,19 +2025,37 @@
         <w:pStyle w:val="Caption"/>
       </w:pPr>
       <w:r>
-        <w:t>Figure 1. Welcome banner and plan catalogue from an actual execution.</w:t>
+        <w:t>Figure 1. Live console plan listing with the actual A input.</w:t>
       </w:r>
     </w:p>
     <w:p>
       <w:r>
-        <w:t>Choose B. Enter Woolies, plan 1, 20 users and No. Confirm a monthly total of $400.00 and no discount.</w:t>
+        <w:t>All five subscription entries and the summary were captured in one uninterrupted process. The supplementary negative-input check follows the five-entry summary. Raw terminal output and keyboard events accompany the source ZIP.</w:t>
+      </w:r>
+    </w:p>
+    <w:p>
+      <w:r>
+        <w:br w:type="page"/>
+      </w:r>
+    </w:p>
+    <w:p>
+      <w:pPr>
+        <w:pStyle w:val="Heading1"/>
+      </w:pPr>
+      <w:r>
+        <w:t>4 Create Standard without a discount</w:t>
+      </w:r>
+    </w:p>
+    <w:p>
+      <w:r>
+        <w:t>Enter B, Woolies, plan 1, 20 users and No. The console accepts the entry and confirms $20.00 per user and a total monthly price of $400.00.</w:t>
       </w:r>
     </w:p>
     <w:p>
       <w:r>
         <w:drawing>
           <wp:inline xmlns:a="http://schemas.openxmlformats.org/drawingml/2006/main" xmlns:pic="http://schemas.openxmlformats.org/drawingml/2006/picture">
-            <wp:extent cx="6172200" cy="2571750"/>
+            <wp:extent cx="6172200" cy="4812224"/>
             <wp:docPr id="2" name="Picture 2"/>
             <wp:cNvGraphicFramePr>
               <a:graphicFrameLocks noChangeAspect="1"/>
@@ -2062,11 +2064,11 @@
               <a:graphicData uri="http://schemas.openxmlformats.org/drawingml/2006/picture">
                 <pic:pic>
                   <pic:nvPicPr>
-                    <pic:cNvPr id="0" name="capture-2.png"/>
+                    <pic:cNvPr id="0" name="02-woolies.jpg"/>
                     <pic:cNvPicPr/>
                   </pic:nvPicPr>
                   <pic:blipFill>
-                    <a:blip r:embed="rId31"/>
+                    <a:blip r:embed="rId38"/>
                     <a:stretch>
                       <a:fillRect/>
                     </a:stretch>
@@ -2074,7 +2076,7 @@
                   <pic:spPr>
                     <a:xfrm>
                       <a:off x="0" y="0"/>
-                      <a:ext cx="6172200" cy="2571750"/>
+                      <a:ext cx="6172200" cy="4812224"/>
                     </a:xfrm>
                     <a:prstGeom prst="rect"/>
                   </pic:spPr>
@@ -2090,7 +2092,7 @@
         <w:pStyle w:val="Caption"/>
       </w:pPr>
       <w:r>
-        <w:t>Figure 2. Entry 1 confirms Standard at $20.00 per user for 20 users.</w:t>
+        <w:t>Figure 2. Entry 1 shows the prompts, entered values and saved confirmation.</w:t>
       </w:r>
     </w:p>
     <w:p>
@@ -2103,19 +2105,19 @@
         <w:pStyle w:val="Heading1"/>
       </w:pPr>
       <w:r>
-        <w:t>4 Create and confirm subscriptions</w:t>
+        <w:t>4 Apply the student discount</w:t>
       </w:r>
     </w:p>
     <w:p>
       <w:r>
-        <w:t>For entry 2, choose B and enter Coles, plan 2, 25 users and JUST. The discount reduces $750.00 by $112.50 to $637.50.</w:t>
+        <w:t>Enter B, Coles, plan 2, 25 users and JUST. Premium has a $750.00 subtotal; the 15% discount is $112.50 and the final monthly total is $637.50.</w:t>
       </w:r>
     </w:p>
     <w:p>
       <w:r>
         <w:drawing>
           <wp:inline xmlns:a="http://schemas.openxmlformats.org/drawingml/2006/main" xmlns:pic="http://schemas.openxmlformats.org/drawingml/2006/picture">
-            <wp:extent cx="6172200" cy="2571750"/>
+            <wp:extent cx="6172200" cy="4812224"/>
             <wp:docPr id="3" name="Picture 3"/>
             <wp:cNvGraphicFramePr>
               <a:graphicFrameLocks noChangeAspect="1"/>
@@ -2124,11 +2126,11 @@
               <a:graphicData uri="http://schemas.openxmlformats.org/drawingml/2006/picture">
                 <pic:pic>
                   <pic:nvPicPr>
-                    <pic:cNvPr id="0" name="capture-3.png"/>
+                    <pic:cNvPr id="0" name="03-coles.jpg"/>
                     <pic:cNvPicPr/>
                   </pic:nvPicPr>
                   <pic:blipFill>
-                    <a:blip r:embed="rId32"/>
+                    <a:blip r:embed="rId39"/>
                     <a:stretch>
                       <a:fillRect/>
                     </a:stretch>
@@ -2136,7 +2138,7 @@
                   <pic:spPr>
                     <a:xfrm>
                       <a:off x="0" y="0"/>
-                      <a:ext cx="6172200" cy="2571750"/>
+                      <a:ext cx="6172200" cy="4812224"/>
                     </a:xfrm>
                     <a:prstGeom prst="rect"/>
                   </pic:spPr>
@@ -2152,19 +2154,32 @@
         <w:pStyle w:val="Caption"/>
       </w:pPr>
       <w:r>
-        <w:t>Figure 3. Entry 2 confirms the 15% student discount.</w:t>
+        <w:t>Figure 3. Entry 2 demonstrates the JUST code and correct discounted price.</w:t>
       </w:r>
     </w:p>
     <w:p>
       <w:r>
-        <w:t>For entry 3, enter Harbour Studio, plan 0, 1 user and No. The minimum accepted user count produces $10.00.</w:t>
+        <w:br w:type="page"/>
+      </w:r>
+    </w:p>
+    <w:p>
+      <w:pPr>
+        <w:pStyle w:val="Heading1"/>
+      </w:pPr>
+      <w:r>
+        <w:t>4 Test the minimum user count</w:t>
+      </w:r>
+    </w:p>
+    <w:p>
+      <w:r>
+        <w:t>Enter B, Harbour Studio, plan 0, 1 user and No. The lower accepted boundary gives a Startup monthly total of $10.00.</w:t>
       </w:r>
     </w:p>
     <w:p>
       <w:r>
         <w:drawing>
           <wp:inline xmlns:a="http://schemas.openxmlformats.org/drawingml/2006/main" xmlns:pic="http://schemas.openxmlformats.org/drawingml/2006/picture">
-            <wp:extent cx="6172200" cy="2571750"/>
+            <wp:extent cx="6172200" cy="4812224"/>
             <wp:docPr id="4" name="Picture 4"/>
             <wp:cNvGraphicFramePr>
               <a:graphicFrameLocks noChangeAspect="1"/>
@@ -2173,11 +2188,11 @@
               <a:graphicData uri="http://schemas.openxmlformats.org/drawingml/2006/picture">
                 <pic:pic>
                   <pic:nvPicPr>
-                    <pic:cNvPr id="0" name="capture-4.png"/>
+                    <pic:cNvPr id="0" name="04-harbour.jpg"/>
                     <pic:cNvPicPr/>
                   </pic:nvPicPr>
                   <pic:blipFill>
-                    <a:blip r:embed="rId33"/>
+                    <a:blip r:embed="rId40"/>
                     <a:stretch>
                       <a:fillRect/>
                     </a:stretch>
@@ -2185,7 +2200,7 @@
                   <pic:spPr>
                     <a:xfrm>
                       <a:off x="0" y="0"/>
-                      <a:ext cx="6172200" cy="2571750"/>
+                      <a:ext cx="6172200" cy="4812224"/>
                     </a:xfrm>
                     <a:prstGeom prst="rect"/>
                   </pic:spPr>
@@ -2201,7 +2216,7 @@
         <w:pStyle w:val="Caption"/>
       </w:pPr>
       <w:r>
-        <w:t>Figure 4. Entry 3 confirms Startup at the lower user boundary.</w:t>
+        <w:t>Figure 4. Entry 3 confirms the lower boundary of one user.</w:t>
       </w:r>
     </w:p>
     <w:p>
@@ -2214,19 +2229,19 @@
         <w:pStyle w:val="Heading1"/>
       </w:pPr>
       <w:r>
-        <w:t>4 Complete five entries</w:t>
+        <w:t>4 Test the maximum user count</w:t>
       </w:r>
     </w:p>
     <w:p>
       <w:r>
-        <w:t>For entry 4, enter Summit Logistics, plan 3, 100 users and JUST. The upper user boundary is accepted and the total is $3400.00.</w:t>
+        <w:t>Enter B, Summit Logistics, plan 3, 100 users and JUST. Enterprise produces a $4000.00 subtotal, a $600.00 discount and a $3400.00 monthly total.</w:t>
       </w:r>
     </w:p>
     <w:p>
       <w:r>
         <w:drawing>
           <wp:inline xmlns:a="http://schemas.openxmlformats.org/drawingml/2006/main" xmlns:pic="http://schemas.openxmlformats.org/drawingml/2006/picture">
-            <wp:extent cx="6172200" cy="2571750"/>
+            <wp:extent cx="6172200" cy="4812224"/>
             <wp:docPr id="5" name="Picture 5"/>
             <wp:cNvGraphicFramePr>
               <a:graphicFrameLocks noChangeAspect="1"/>
@@ -2235,11 +2250,11 @@
               <a:graphicData uri="http://schemas.openxmlformats.org/drawingml/2006/picture">
                 <pic:pic>
                   <pic:nvPicPr>
-                    <pic:cNvPr id="0" name="capture-5.png"/>
+                    <pic:cNvPr id="0" name="05-summit.jpg"/>
                     <pic:cNvPicPr/>
                   </pic:nvPicPr>
                   <pic:blipFill>
-                    <a:blip r:embed="rId34"/>
+                    <a:blip r:embed="rId41"/>
                     <a:stretch>
                       <a:fillRect/>
                     </a:stretch>
@@ -2247,7 +2262,7 @@
                   <pic:spPr>
                     <a:xfrm>
                       <a:off x="0" y="0"/>
-                      <a:ext cx="6172200" cy="2571750"/>
+                      <a:ext cx="6172200" cy="4812224"/>
                     </a:xfrm>
                     <a:prstGeom prst="rect"/>
                   </pic:spPr>
@@ -2263,19 +2278,32 @@
         <w:pStyle w:val="Caption"/>
       </w:pPr>
       <w:r>
-        <w:t>Figure 5. Entry 4 confirms Enterprise at the upper user boundary.</w:t>
+        <w:t>Figure 5. Entry 4 confirms the upper boundary of 100 users.</w:t>
       </w:r>
     </w:p>
     <w:p>
       <w:r>
-        <w:t>For entry 5, enter Greenfield Dental, plan 1, 10 users and lowercase just. The code is accepted and the total is $170.00.</w:t>
+        <w:br w:type="page"/>
+      </w:r>
+    </w:p>
+    <w:p>
+      <w:pPr>
+        <w:pStyle w:val="Heading1"/>
+      </w:pPr>
+      <w:r>
+        <w:t>4 Accept a lowercase discount code</w:t>
+      </w:r>
+    </w:p>
+    <w:p>
+      <w:r>
+        <w:t>Enter B, Greenfield Dental, plan 1, 10 users and just. The lowercase code is accepted and reduces the $200.00 subtotal to $170.00.</w:t>
       </w:r>
     </w:p>
     <w:p>
       <w:r>
         <w:drawing>
           <wp:inline xmlns:a="http://schemas.openxmlformats.org/drawingml/2006/main" xmlns:pic="http://schemas.openxmlformats.org/drawingml/2006/picture">
-            <wp:extent cx="6172200" cy="2571750"/>
+            <wp:extent cx="6172200" cy="4812224"/>
             <wp:docPr id="6" name="Picture 6"/>
             <wp:cNvGraphicFramePr>
               <a:graphicFrameLocks noChangeAspect="1"/>
@@ -2284,11 +2312,11 @@
               <a:graphicData uri="http://schemas.openxmlformats.org/drawingml/2006/picture">
                 <pic:pic>
                   <pic:nvPicPr>
-                    <pic:cNvPr id="0" name="capture-6.png"/>
+                    <pic:cNvPr id="0" name="06-greenfield.jpg"/>
                     <pic:cNvPicPr/>
                   </pic:nvPicPr>
                   <pic:blipFill>
-                    <a:blip r:embed="rId35"/>
+                    <a:blip r:embed="rId42"/>
                     <a:stretch>
                       <a:fillRect/>
                     </a:stretch>
@@ -2296,7 +2324,7 @@
                   <pic:spPr>
                     <a:xfrm>
                       <a:off x="0" y="0"/>
-                      <a:ext cx="6172200" cy="2571750"/>
+                      <a:ext cx="6172200" cy="4812224"/>
                     </a:xfrm>
                     <a:prstGeom prst="rect"/>
                   </pic:spPr>
@@ -2325,19 +2353,19 @@
         <w:pStyle w:val="Heading1"/>
       </w:pPr>
       <w:r>
-        <w:t>4 Review the summary</w:t>
+        <w:t>4 Review all five subscriptions</w:t>
       </w:r>
     </w:p>
     <w:p>
       <w:r>
-        <w:t>Choose C after the five entries. Read each business, plan, user count, monthly total and discount indicator. The list contains five records with a combined monthly total of $4617.50. Choose D to exit when finished.</w:t>
+        <w:t>Enter C after the five entries. The same console process displays each business name, plan, user count, total price and Y or N discount flag. Exactly five subscriptions are listed, with a combined monthly total of $4617.50.</w:t>
       </w:r>
     </w:p>
     <w:p>
       <w:r>
         <w:drawing>
           <wp:inline xmlns:a="http://schemas.openxmlformats.org/drawingml/2006/main" xmlns:pic="http://schemas.openxmlformats.org/drawingml/2006/picture">
-            <wp:extent cx="6172200" cy="3199257"/>
+            <wp:extent cx="6172200" cy="4812224"/>
             <wp:docPr id="7" name="Picture 7"/>
             <wp:cNvGraphicFramePr>
               <a:graphicFrameLocks noChangeAspect="1"/>
@@ -2346,11 +2374,11 @@
               <a:graphicData uri="http://schemas.openxmlformats.org/drawingml/2006/picture">
                 <pic:pic>
                   <pic:nvPicPr>
-                    <pic:cNvPr id="0" name="capture-7.png"/>
+                    <pic:cNvPr id="0" name="07-summary.jpg"/>
                     <pic:cNvPicPr/>
                   </pic:nvPicPr>
                   <pic:blipFill>
-                    <a:blip r:embed="rId36"/>
+                    <a:blip r:embed="rId43"/>
                     <a:stretch>
                       <a:fillRect/>
                     </a:stretch>
@@ -2358,7 +2386,7 @@
                   <pic:spPr>
                     <a:xfrm>
                       <a:off x="0" y="0"/>
-                      <a:ext cx="6172200" cy="3199257"/>
+                      <a:ext cx="6172200" cy="4812224"/>
                     </a:xfrm>
                     <a:prstGeom prst="rect"/>
                   </pic:spPr>
@@ -2374,25 +2402,193 @@
         <w:pStyle w:val="Caption"/>
       </w:pPr>
       <w:r>
-        <w:t>Figure 7. The same process lists all five saved subscriptions with the mandatory fields.</w:t>
+        <w:t>Figure 7. Live five-entry summary with the actual C input and all required columns.</w:t>
+      </w:r>
+    </w:p>
+    <w:p>
+      <w:r>
+        <w:br w:type="page"/>
       </w:r>
     </w:p>
     <w:p>
       <w:pPr>
-        <w:pStyle w:val="Heading2"/>
+        <w:pStyle w:val="Heading1"/>
       </w:pPr>
       <w:r>
-        <w:t>Correct invalid inputs</w:t>
+        <w:t>4 Reject invalid input</w:t>
       </w:r>
     </w:p>
     <w:p>
       <w:r>
-        <w:t>Use a whole plan ID from 0 to 3 and a whole user count from 1 to 100. An invalid value keeps the current prompt active. A blank business name or unsupported discount code also requires correction. The program does not silently replace invalid values.</w:t>
+        <w:t>After capturing the five-entry summary, begin a supplementary validation entry. Enter ?, then B, a blank name, Validation Check, plan 4 then 0, and user values 0, 101 and abc. Each invalid field is rejected and the console continues requesting a valid value.</w:t>
       </w:r>
     </w:p>
     <w:p>
       <w:r>
-        <w:t>The validation test supplies an invalid menu, blank name, invalid plan IDs, text, user values 0 and 101, a decimal, integer overflow and BAD as a discount. It then corrects the entry to Standard, 20 users and No. The recorded outcome is exactly one saved subscription at $400.00. The full validation screenshot is included as evidence/capture-8.png in the source archive.</w:t>
+        <w:drawing>
+          <wp:inline xmlns:a="http://schemas.openxmlformats.org/drawingml/2006/main" xmlns:pic="http://schemas.openxmlformats.org/drawingml/2006/picture">
+            <wp:extent cx="6172200" cy="4812224"/>
+            <wp:docPr id="8" name="Picture 8"/>
+            <wp:cNvGraphicFramePr>
+              <a:graphicFrameLocks noChangeAspect="1"/>
+            </wp:cNvGraphicFramePr>
+            <a:graphic>
+              <a:graphicData uri="http://schemas.openxmlformats.org/drawingml/2006/picture">
+                <pic:pic>
+                  <pic:nvPicPr>
+                    <pic:cNvPr id="0" name="08-validation.jpg"/>
+                    <pic:cNvPicPr/>
+                  </pic:nvPicPr>
+                  <pic:blipFill>
+                    <a:blip r:embed="rId44"/>
+                    <a:stretch>
+                      <a:fillRect/>
+                    </a:stretch>
+                  </pic:blipFill>
+                  <pic:spPr>
+                    <a:xfrm>
+                      <a:off x="0" y="0"/>
+                      <a:ext cx="6172200" cy="4812224"/>
+                    </a:xfrm>
+                    <a:prstGeom prst="rect"/>
+                  </pic:spPr>
+                </pic:pic>
+              </a:graphicData>
+            </a:graphic>
+          </wp:inline>
+        </w:drawing>
+      </w:r>
+    </w:p>
+    <w:p>
+      <w:pPr>
+        <w:pStyle w:val="Caption"/>
+      </w:pPr>
+      <w:r>
+        <w:t>Figure 8. Actual invalid menu, blank name, invalid plan and invalid user inputs.</w:t>
+      </w:r>
+    </w:p>
+    <w:p>
+      <w:r>
+        <w:br w:type="page"/>
+      </w:r>
+    </w:p>
+    <w:p>
+      <w:pPr>
+        <w:pStyle w:val="Heading1"/>
+      </w:pPr>
+      <w:r>
+        <w:t>4 Correct errors and save</w:t>
+      </w:r>
+    </w:p>
+    <w:p>
+      <w:r>
+        <w:t>Continue the supplementary entry with 1 user. Enter BAD as the discount code; the console rejects it. Enter No to save one valid Startup subscription for Validation Check at $10.00. This is a sixth demonstration entry created after the five-entry summary.</w:t>
+      </w:r>
+    </w:p>
+    <w:p>
+      <w:r>
+        <w:drawing>
+          <wp:inline xmlns:a="http://schemas.openxmlformats.org/drawingml/2006/main" xmlns:pic="http://schemas.openxmlformats.org/drawingml/2006/picture">
+            <wp:extent cx="6172200" cy="4812224"/>
+            <wp:docPr id="9" name="Picture 9"/>
+            <wp:cNvGraphicFramePr>
+              <a:graphicFrameLocks noChangeAspect="1"/>
+            </wp:cNvGraphicFramePr>
+            <a:graphic>
+              <a:graphicData uri="http://schemas.openxmlformats.org/drawingml/2006/picture">
+                <pic:pic>
+                  <pic:nvPicPr>
+                    <pic:cNvPr id="0" name="09-recovery.jpg"/>
+                    <pic:cNvPicPr/>
+                  </pic:nvPicPr>
+                  <pic:blipFill>
+                    <a:blip r:embed="rId45"/>
+                    <a:stretch>
+                      <a:fillRect/>
+                    </a:stretch>
+                  </pic:blipFill>
+                  <pic:spPr>
+                    <a:xfrm>
+                      <a:off x="0" y="0"/>
+                      <a:ext cx="6172200" cy="4812224"/>
+                    </a:xfrm>
+                    <a:prstGeom prst="rect"/>
+                  </pic:spPr>
+                </pic:pic>
+              </a:graphicData>
+            </a:graphic>
+          </wp:inline>
+        </w:drawing>
+      </w:r>
+    </w:p>
+    <w:p>
+      <w:pPr>
+        <w:pStyle w:val="Caption"/>
+      </w:pPr>
+      <w:r>
+        <w:t>Figure 9. Invalid discount rejection and successful correction without a crash.</w:t>
+      </w:r>
+    </w:p>
+    <w:p>
+      <w:r>
+        <w:br w:type="page"/>
+      </w:r>
+    </w:p>
+    <w:p>
+      <w:pPr>
+        <w:pStyle w:val="Heading1"/>
+      </w:pPr>
+      <w:r>
+        <w:t>4 Quit the console</w:t>
+      </w:r>
+    </w:p>
+    <w:p>
+      <w:r>
+        <w:t>Enter D. The console displays the goodbye message and the .NET process exits normally. Session-only records are discarded on exit.</w:t>
+      </w:r>
+    </w:p>
+    <w:p>
+      <w:r>
+        <w:drawing>
+          <wp:inline xmlns:a="http://schemas.openxmlformats.org/drawingml/2006/main" xmlns:pic="http://schemas.openxmlformats.org/drawingml/2006/picture">
+            <wp:extent cx="6172200" cy="4812224"/>
+            <wp:docPr id="10" name="Picture 10"/>
+            <wp:cNvGraphicFramePr>
+              <a:graphicFrameLocks noChangeAspect="1"/>
+            </wp:cNvGraphicFramePr>
+            <a:graphic>
+              <a:graphicData uri="http://schemas.openxmlformats.org/drawingml/2006/picture">
+                <pic:pic>
+                  <pic:nvPicPr>
+                    <pic:cNvPr id="0" name="10-exit.jpg"/>
+                    <pic:cNvPicPr/>
+                  </pic:nvPicPr>
+                  <pic:blipFill>
+                    <a:blip r:embed="rId46"/>
+                    <a:stretch>
+                      <a:fillRect/>
+                    </a:stretch>
+                  </pic:blipFill>
+                  <pic:spPr>
+                    <a:xfrm>
+                      <a:off x="0" y="0"/>
+                      <a:ext cx="6172200" cy="4812224"/>
+                    </a:xfrm>
+                    <a:prstGeom prst="rect"/>
+                  </pic:spPr>
+                </pic:pic>
+              </a:graphicData>
+            </a:graphic>
+          </wp:inline>
+        </w:drawing>
+      </w:r>
+    </w:p>
+    <w:p>
+      <w:pPr>
+        <w:pStyle w:val="Caption"/>
+      </w:pPr>
+      <w:r>
+        <w:t>Figure 10. Actual D input and successful normal termination.</w:t>
       </w:r>
     </w:p>
     <w:p>
@@ -2421,8 +2617,8 @@
       </w:tblPr>
       <w:tblGrid>
         <w:gridCol w:w="648"/>
-        <w:gridCol w:w="7992"/>
-        <w:gridCol w:w="1080"/>
+        <w:gridCol w:w="5832"/>
+        <w:gridCol w:w="3240"/>
       </w:tblGrid>
       <w:tr>
         <w:trPr>
@@ -2430,7 +2626,7 @@
         </w:trPr>
         <w:tc>
           <w:tcPr>
-            <w:tcW w:type="dxa" w:w="3278"/>
+            <w:tcW w:type="dxa" w:w="648"/>
             <w:shd w:fill="E4EDF4"/>
             <w:tcBorders>
               <w:top w:val="single" w:sz="4" w:color="D9D9D9"/>
@@ -2454,7 +2650,7 @@
         </w:tc>
         <w:tc>
           <w:tcPr>
-            <w:tcW w:type="dxa" w:w="3278"/>
+            <w:tcW w:type="dxa" w:w="5832"/>
             <w:shd w:fill="E4EDF4"/>
             <w:tcBorders>
               <w:top w:val="single" w:sz="4" w:color="D9D9D9"/>
@@ -2478,7 +2674,7 @@
         </w:tc>
         <w:tc>
           <w:tcPr>
-            <w:tcW w:type="dxa" w:w="3278"/>
+            <w:tcW w:type="dxa" w:w="3240"/>
             <w:shd w:fill="E4EDF4"/>
             <w:tcBorders>
               <w:top w:val="single" w:sz="4" w:color="D9D9D9"/>
@@ -2529,7 +2725,7 @@
         </w:tc>
         <w:tc>
           <w:tcPr>
-            <w:tcW w:type="dxa" w:w="7992"/>
+            <w:tcW w:type="dxa" w:w="5832"/>
             <w:shd w:fill="FFFFFF"/>
             <w:tcBorders>
               <w:top w:val="single" w:sz="4" w:color="D9D9D9"/>
@@ -2553,7 +2749,7 @@
         </w:tc>
         <w:tc>
           <w:tcPr>
-            <w:tcW w:type="dxa" w:w="1080"/>
+            <w:tcW w:type="dxa" w:w="3240"/>
             <w:shd w:fill="FFFFFF"/>
             <w:tcBorders>
               <w:top w:val="single" w:sz="4" w:color="D9D9D9"/>
@@ -2563,15 +2759,11 @@
             </w:tcBorders>
           </w:tcPr>
           <w:p>
-            <w:pPr>
-              <w:spacing w:after="100" w:before="100"/>
-            </w:pPr>
             <w:r>
               <w:rPr>
-                <w:b w:val="0"/>
                 <w:sz w:val="18"/>
               </w:rPr>
-              <w:t>PASS</w:t>
+              <w:t>PASS — banner; four plan prices; normal exit</w:t>
             </w:r>
           </w:p>
         </w:tc>
@@ -2604,7 +2796,7 @@
         </w:tc>
         <w:tc>
           <w:tcPr>
-            <w:tcW w:type="dxa" w:w="7992"/>
+            <w:tcW w:type="dxa" w:w="5832"/>
             <w:shd w:fill="F6F8FA"/>
             <w:tcBorders>
               <w:top w:val="single" w:sz="4" w:color="D9D9D9"/>
@@ -2628,7 +2820,7 @@
         </w:tc>
         <w:tc>
           <w:tcPr>
-            <w:tcW w:type="dxa" w:w="1080"/>
+            <w:tcW w:type="dxa" w:w="3240"/>
             <w:shd w:fill="F6F8FA"/>
             <w:tcBorders>
               <w:top w:val="single" w:sz="4" w:color="D9D9D9"/>
@@ -2638,15 +2830,11 @@
             </w:tcBorders>
           </w:tcPr>
           <w:p>
-            <w:pPr>
-              <w:spacing w:after="100" w:before="100"/>
-            </w:pPr>
             <w:r>
               <w:rPr>
-                <w:b w:val="0"/>
                 <w:sz w:val="18"/>
               </w:rPr>
-              <w:t>PASS</w:t>
+              <w:t>PASS — empty-list guidance displayed</w:t>
             </w:r>
           </w:p>
         </w:tc>
@@ -2679,7 +2867,7 @@
         </w:tc>
         <w:tc>
           <w:tcPr>
-            <w:tcW w:type="dxa" w:w="7992"/>
+            <w:tcW w:type="dxa" w:w="5832"/>
             <w:shd w:fill="FFFFFF"/>
             <w:tcBorders>
               <w:top w:val="single" w:sz="4" w:color="D9D9D9"/>
@@ -2703,7 +2891,7 @@
         </w:tc>
         <w:tc>
           <w:tcPr>
-            <w:tcW w:type="dxa" w:w="1080"/>
+            <w:tcW w:type="dxa" w:w="3240"/>
             <w:shd w:fill="FFFFFF"/>
             <w:tcBorders>
               <w:top w:val="single" w:sz="4" w:color="D9D9D9"/>
@@ -2713,15 +2901,11 @@
             </w:tcBorders>
           </w:tcPr>
           <w:p>
-            <w:pPr>
-              <w:spacing w:after="100" w:before="100"/>
-            </w:pPr>
             <w:r>
               <w:rPr>
-                <w:b w:val="0"/>
                 <w:sz w:val="18"/>
               </w:rPr>
-              <w:t>PASS</w:t>
+              <w:t>PASS — 5 correct rows; $4617.50 total</w:t>
             </w:r>
           </w:p>
         </w:tc>
@@ -2754,7 +2938,7 @@
         </w:tc>
         <w:tc>
           <w:tcPr>
-            <w:tcW w:type="dxa" w:w="7992"/>
+            <w:tcW w:type="dxa" w:w="5832"/>
             <w:shd w:fill="F6F8FA"/>
             <w:tcBorders>
               <w:top w:val="single" w:sz="4" w:color="D9D9D9"/>
@@ -2778,7 +2962,7 @@
         </w:tc>
         <w:tc>
           <w:tcPr>
-            <w:tcW w:type="dxa" w:w="1080"/>
+            <w:tcW w:type="dxa" w:w="3240"/>
             <w:shd w:fill="F6F8FA"/>
             <w:tcBorders>
               <w:top w:val="single" w:sz="4" w:color="D9D9D9"/>
@@ -2788,15 +2972,11 @@
             </w:tcBorders>
           </w:tcPr>
           <w:p>
-            <w:pPr>
-              <w:spacing w:after="100" w:before="100"/>
-            </w:pPr>
             <w:r>
               <w:rPr>
-                <w:b w:val="0"/>
                 <w:sz w:val="18"/>
               </w:rPr>
-              <w:t>PASS</w:t>
+              <w:t>PASS — errors reported; one $400.00 entry</w:t>
             </w:r>
           </w:p>
         </w:tc>
@@ -2829,7 +3009,7 @@
         </w:tc>
         <w:tc>
           <w:tcPr>
-            <w:tcW w:type="dxa" w:w="7992"/>
+            <w:tcW w:type="dxa" w:w="5832"/>
             <w:shd w:fill="FFFFFF"/>
             <w:tcBorders>
               <w:top w:val="single" w:sz="4" w:color="D9D9D9"/>
@@ -2853,7 +3033,7 @@
         </w:tc>
         <w:tc>
           <w:tcPr>
-            <w:tcW w:type="dxa" w:w="1080"/>
+            <w:tcW w:type="dxa" w:w="3240"/>
             <w:shd w:fill="FFFFFF"/>
             <w:tcBorders>
               <w:top w:val="single" w:sz="4" w:color="D9D9D9"/>
@@ -2863,15 +3043,11 @@
             </w:tcBorders>
           </w:tcPr>
           <w:p>
-            <w:pPr>
-              <w:spacing w:after="100" w:before="100"/>
-            </w:pPr>
             <w:r>
               <w:rPr>
-                <w:b w:val="0"/>
                 <w:sz w:val="18"/>
               </w:rPr>
-              <w:t>PASS</w:t>
+              <w:t>PASS — $1000.00</w:t>
             </w:r>
           </w:p>
         </w:tc>
@@ -2904,7 +3080,7 @@
         </w:tc>
         <w:tc>
           <w:tcPr>
-            <w:tcW w:type="dxa" w:w="7992"/>
+            <w:tcW w:type="dxa" w:w="5832"/>
             <w:shd w:fill="F6F8FA"/>
             <w:tcBorders>
               <w:top w:val="single" w:sz="4" w:color="D9D9D9"/>
@@ -2928,7 +3104,7 @@
         </w:tc>
         <w:tc>
           <w:tcPr>
-            <w:tcW w:type="dxa" w:w="1080"/>
+            <w:tcW w:type="dxa" w:w="3240"/>
             <w:shd w:fill="F6F8FA"/>
             <w:tcBorders>
               <w:top w:val="single" w:sz="4" w:color="D9D9D9"/>
@@ -2938,15 +3114,11 @@
             </w:tcBorders>
           </w:tcPr>
           <w:p>
-            <w:pPr>
-              <w:spacing w:after="100" w:before="100"/>
-            </w:pPr>
             <w:r>
               <w:rPr>
-                <w:b w:val="0"/>
                 <w:sz w:val="18"/>
               </w:rPr>
-              <w:t>PASS</w:t>
+              <w:t>PASS — $2000.00</w:t>
             </w:r>
           </w:p>
         </w:tc>
@@ -2979,7 +3151,7 @@
         </w:tc>
         <w:tc>
           <w:tcPr>
-            <w:tcW w:type="dxa" w:w="7992"/>
+            <w:tcW w:type="dxa" w:w="5832"/>
             <w:shd w:fill="FFFFFF"/>
             <w:tcBorders>
               <w:top w:val="single" w:sz="4" w:color="D9D9D9"/>
@@ -3003,7 +3175,7 @@
         </w:tc>
         <w:tc>
           <w:tcPr>
-            <w:tcW w:type="dxa" w:w="1080"/>
+            <w:tcW w:type="dxa" w:w="3240"/>
             <w:shd w:fill="FFFFFF"/>
             <w:tcBorders>
               <w:top w:val="single" w:sz="4" w:color="D9D9D9"/>
@@ -3013,15 +3185,11 @@
             </w:tcBorders>
           </w:tcPr>
           <w:p>
-            <w:pPr>
-              <w:spacing w:after="100" w:before="100"/>
-            </w:pPr>
             <w:r>
               <w:rPr>
-                <w:b w:val="0"/>
                 <w:sz w:val="18"/>
               </w:rPr>
-              <w:t>PASS</w:t>
+              <w:t>PASS — $3000.00</w:t>
             </w:r>
           </w:p>
         </w:tc>
@@ -3054,7 +3222,7 @@
         </w:tc>
         <w:tc>
           <w:tcPr>
-            <w:tcW w:type="dxa" w:w="7992"/>
+            <w:tcW w:type="dxa" w:w="5832"/>
             <w:shd w:fill="F6F8FA"/>
             <w:tcBorders>
               <w:top w:val="single" w:sz="4" w:color="D9D9D9"/>
@@ -3078,7 +3246,7 @@
         </w:tc>
         <w:tc>
           <w:tcPr>
-            <w:tcW w:type="dxa" w:w="1080"/>
+            <w:tcW w:type="dxa" w:w="3240"/>
             <w:shd w:fill="F6F8FA"/>
             <w:tcBorders>
               <w:top w:val="single" w:sz="4" w:color="D9D9D9"/>
@@ -3088,15 +3256,11 @@
             </w:tcBorders>
           </w:tcPr>
           <w:p>
-            <w:pPr>
-              <w:spacing w:after="100" w:before="100"/>
-            </w:pPr>
             <w:r>
               <w:rPr>
-                <w:b w:val="0"/>
                 <w:sz w:val="18"/>
               </w:rPr>
-              <w:t>PASS</w:t>
+              <w:t>PASS — $4000.00</w:t>
             </w:r>
           </w:p>
         </w:tc>
@@ -3129,7 +3293,7 @@
         </w:tc>
         <w:tc>
           <w:tcPr>
-            <w:tcW w:type="dxa" w:w="7992"/>
+            <w:tcW w:type="dxa" w:w="5832"/>
             <w:shd w:fill="FFFFFF"/>
             <w:tcBorders>
               <w:top w:val="single" w:sz="4" w:color="D9D9D9"/>
@@ -3153,7 +3317,7 @@
         </w:tc>
         <w:tc>
           <w:tcPr>
-            <w:tcW w:type="dxa" w:w="1080"/>
+            <w:tcW w:type="dxa" w:w="3240"/>
             <w:shd w:fill="FFFFFF"/>
             <w:tcBorders>
               <w:top w:val="single" w:sz="4" w:color="D9D9D9"/>
@@ -3163,15 +3327,11 @@
             </w:tcBorders>
           </w:tcPr>
           <w:p>
-            <w:pPr>
-              <w:spacing w:after="100" w:before="100"/>
-            </w:pPr>
             <w:r>
               <w:rPr>
-                <w:b w:val="0"/>
                 <w:sz w:val="18"/>
               </w:rPr>
-              <w:t>PASS</w:t>
+              <w:t>PASS — $8.50; discount Y</w:t>
             </w:r>
           </w:p>
         </w:tc>
@@ -3204,7 +3364,7 @@
         </w:tc>
         <w:tc>
           <w:tcPr>
-            <w:tcW w:type="dxa" w:w="7992"/>
+            <w:tcW w:type="dxa" w:w="5832"/>
             <w:shd w:fill="F6F8FA"/>
             <w:tcBorders>
               <w:top w:val="single" w:sz="4" w:color="D9D9D9"/>
@@ -3228,7 +3388,7 @@
         </w:tc>
         <w:tc>
           <w:tcPr>
-            <w:tcW w:type="dxa" w:w="1080"/>
+            <w:tcW w:type="dxa" w:w="3240"/>
             <w:shd w:fill="F6F8FA"/>
             <w:tcBorders>
               <w:top w:val="single" w:sz="4" w:color="D9D9D9"/>
@@ -3238,15 +3398,11 @@
             </w:tcBorders>
           </w:tcPr>
           <w:p>
-            <w:pPr>
-              <w:spacing w:after="100" w:before="100"/>
-            </w:pPr>
             <w:r>
               <w:rPr>
-                <w:b w:val="0"/>
                 <w:sz w:val="18"/>
               </w:rPr>
-              <w:t>PASS</w:t>
+              <w:t>PASS — long name rejected; Valid saved</w:t>
             </w:r>
           </w:p>
         </w:tc>
@@ -3279,7 +3435,7 @@
         </w:tc>
         <w:tc>
           <w:tcPr>
-            <w:tcW w:type="dxa" w:w="7992"/>
+            <w:tcW w:type="dxa" w:w="5832"/>
             <w:shd w:fill="FFFFFF"/>
             <w:tcBorders>
               <w:top w:val="single" w:sz="4" w:color="D9D9D9"/>
@@ -3303,7 +3459,7 @@
         </w:tc>
         <w:tc>
           <w:tcPr>
-            <w:tcW w:type="dxa" w:w="1080"/>
+            <w:tcW w:type="dxa" w:w="3240"/>
             <w:shd w:fill="FFFFFF"/>
             <w:tcBorders>
               <w:top w:val="single" w:sz="4" w:color="D9D9D9"/>
@@ -3313,15 +3469,11 @@
             </w:tcBorders>
           </w:tcPr>
           <w:p>
-            <w:pPr>
-              <w:spacing w:after="100" w:before="100"/>
-            </w:pPr>
             <w:r>
               <w:rPr>
-                <w:b w:val="0"/>
                 <w:sz w:val="18"/>
               </w:rPr>
-              <w:t>PASS</w:t>
+              <w:t>PASS — clean exit; unfinished entry absent</w:t>
             </w:r>
           </w:p>
         </w:tc>
@@ -3354,7 +3506,7 @@
         </w:tc>
         <w:tc>
           <w:tcPr>
-            <w:tcW w:type="dxa" w:w="7992"/>
+            <w:tcW w:type="dxa" w:w="5832"/>
             <w:shd w:fill="F6F8FA"/>
             <w:tcBorders>
               <w:top w:val="single" w:sz="4" w:color="D9D9D9"/>
@@ -3378,7 +3530,7 @@
         </w:tc>
         <w:tc>
           <w:tcPr>
-            <w:tcW w:type="dxa" w:w="1080"/>
+            <w:tcW w:type="dxa" w:w="3240"/>
             <w:shd w:fill="F6F8FA"/>
             <w:tcBorders>
               <w:top w:val="single" w:sz="4" w:color="D9D9D9"/>
@@ -3388,15 +3540,11 @@
             </w:tcBorders>
           </w:tcPr>
           <w:p>
-            <w:pPr>
-              <w:spacing w:after="100" w:before="100"/>
-            </w:pPr>
             <w:r>
               <w:rPr>
-                <w:b w:val="0"/>
                 <w:sz w:val="18"/>
               </w:rPr>
-              <w:t>PASS</w:t>
+              <w:t>PASS — previous entries absent</w:t>
             </w:r>
           </w:p>
         </w:tc>

</xml_diff>